<commit_message>
Keep the Tigger New Year pack text-only.
No banners, carousel, creatives, or new photos for this offer.

Co-authored-by: Igor-Lark <Igor-Lark@users.noreply.github.com>
</commit_message>
<xml_diff>
--- a/cursor/Tigger_NG2027_offer_ads.docx
+++ b/cursor/Tigger_NG2027_offer_ads.docx
@@ -24,7 +24,7 @@
           <w:color w:val="14283A"/>
           <w:sz w:val="22"/>
         </w:rPr>
-        <w:t>Черновик. В Директ не залито. Сайт не менялся. Катер «Сириус», яхта «Лилу», групповые билеты и рыбалка в оффер не входят.</w:t>
+        <w:t>Черновик, только текст. В Директ не залито. Сайт не менялся. Картинок нет. Катер «Сириус», яхта «Лилу», групповые билеты и рыбалка в оффер не входят.</w:t>
       </w:r>
     </w:p>
     <w:p>
@@ -392,6 +392,20 @@
           <w:sz w:val="22"/>
         </w:rPr>
         <w:t>Страницу /yacht_tigger и лендинг с «Сириусом» и «Лилу» сейчас не трогать.</w:t>
+      </w:r>
+    </w:p>
+    <w:p>
+      <w:pPr>
+        <w:pStyle w:val="ListBullet"/>
+      </w:pPr>
+      <w:r>
+        <w:rPr>
+          <w:rFonts w:ascii="Calibri" w:hAnsi="Calibri"/>
+          <w:b w:val="0"/>
+          <w:color w:val="14283A"/>
+          <w:sz w:val="22"/>
+        </w:rPr>
+        <w:t>Картинки не нужны: без баннеров, карусели, креативов и новых фото. Только текст объявлений.</w:t>
       </w:r>
     </w:p>
     <w:p>

</xml_diff>

<commit_message>
File the two Tigger New Year RSA creatives.
Search ads stay text-only. The wide 3:2 file and the square file are stored for display and are not uploaded.

Co-authored-by: Igor-Lark <Igor-Lark@users.noreply.github.com>
</commit_message>
<xml_diff>
--- a/cursor/Tigger_NG2027_offer_ads.docx
+++ b/cursor/Tigger_NG2027_offer_ads.docx
@@ -24,7 +24,7 @@
           <w:color w:val="14283A"/>
           <w:sz w:val="22"/>
         </w:rPr>
-        <w:t>Черновик, только текст. В Директ не залито. Сайт не менялся. Картинок нет. Катер «Сириус», яхта «Лилу», групповые билеты и рыбалка в оффер не входят.</w:t>
+        <w:t>Черновик. В Директ не залито. Сайт не менялся. Поиск без картинок. Для РСЯ — два файла заказчика, сети не включены. Катер «Сириус», яхта «Лилу», групповые билеты и рыбалка в оффер не входят.</w:t>
       </w:r>
     </w:p>
     <w:p>
@@ -335,7 +335,21 @@
           <w:color w:val="14283A"/>
           <w:sz w:val="22"/>
         </w:rPr>
-        <w:t>Две группы в текущей РК. Новую кампанию не заводить. РСЯ не включать. Галерею услуг не включать.</w:t>
+        <w:t>Две текстовые группы в текущей РК. Новую кампанию не заводить. Галерею услуг не включать.</w:t>
+      </w:r>
+    </w:p>
+    <w:p>
+      <w:pPr>
+        <w:pStyle w:val="ListBullet"/>
+      </w:pPr>
+      <w:r>
+        <w:rPr>
+          <w:rFonts w:ascii="Calibri" w:hAnsi="Calibri"/>
+          <w:b w:val="0"/>
+          <w:color w:val="14283A"/>
+          <w:sz w:val="22"/>
+        </w:rPr>
+        <w:t>РСЯ в этой РК не включать. Два креатива храним до отдельного «да».</w:t>
       </w:r>
     </w:p>
     <w:p>
@@ -405,7 +419,7 @@
           <w:color w:val="14283A"/>
           <w:sz w:val="22"/>
         </w:rPr>
-        <w:t>Картинки не нужны: без баннеров, карусели, креативов и новых фото. Только текст объявлений.</w:t>
+        <w:t>Поиск без картинок. Новые макеты не рисуем.</w:t>
       </w:r>
     </w:p>
     <w:p>
@@ -2417,7 +2431,167 @@
         <w:rPr>
           <w:color w:val="14283A"/>
         </w:rPr>
-        <w:t>5. Вопросы до публикации</w:t>
+        <w:t>5. Креативы РСЯ, файлы заказчика</w:t>
+      </w:r>
+    </w:p>
+    <w:p>
+      <w:pPr>
+        <w:spacing w:after="120" w:before="0"/>
+      </w:pPr>
+      <w:r>
+        <w:rPr>
+          <w:rFonts w:ascii="Calibri" w:hAnsi="Calibri"/>
+          <w:b w:val="0"/>
+          <w:color w:val="14283A"/>
+          <w:sz w:val="22"/>
+        </w:rPr>
+        <w:t>В Директ не залиты. Других картинок нет. Поиск остаётся без изображений.</w:t>
+      </w:r>
+    </w:p>
+    <w:tbl>
+      <w:tblPr>
+        <w:tblStyle w:val="TableGrid"/>
+        <w:tblW w:type="auto" w:w="0"/>
+        <w:tblLook w:firstColumn="1" w:firstRow="1" w:lastColumn="0" w:lastRow="0" w:noHBand="0" w:noVBand="1" w:val="04A0"/>
+      </w:tblPr>
+      <w:tblGrid>
+        <w:gridCol w:w="3400"/>
+        <w:gridCol w:w="3400"/>
+        <w:gridCol w:w="3400"/>
+      </w:tblGrid>
+      <w:tr>
+        <w:tc>
+          <w:tcPr>
+            <w:tcW w:type="dxa" w:w="3400"/>
+          </w:tcPr>
+          <w:p>
+            <w:r>
+              <w:t>Файл</w:t>
+            </w:r>
+          </w:p>
+        </w:tc>
+        <w:tc>
+          <w:tcPr>
+            <w:tcW w:type="dxa" w:w="3400"/>
+          </w:tcPr>
+          <w:p>
+            <w:r>
+              <w:t>Размер</w:t>
+            </w:r>
+          </w:p>
+        </w:tc>
+        <w:tc>
+          <w:tcPr>
+            <w:tcW w:type="dxa" w:w="3400"/>
+          </w:tcPr>
+          <w:p>
+            <w:r>
+              <w:t>Куда встаёт</w:t>
+            </w:r>
+          </w:p>
+        </w:tc>
+      </w:tr>
+      <w:tr>
+        <w:tc>
+          <w:tcPr>
+            <w:tcW w:type="dxa" w:w="3400"/>
+          </w:tcPr>
+          <w:p>
+            <w:r>
+              <w:t>01-wide-2000x1333.png</w:t>
+            </w:r>
+          </w:p>
+        </w:tc>
+        <w:tc>
+          <w:tcPr>
+            <w:tcW w:type="dxa" w:w="3400"/>
+          </w:tcPr>
+          <w:p>
+            <w:r>
+              <w:t>2000×1333, 3:2, 2,2 МБ</w:t>
+            </w:r>
+          </w:p>
+        </w:tc>
+        <w:tc>
+          <w:tcPr>
+            <w:tcW w:type="dxa" w:w="3400"/>
+          </w:tcPr>
+          <w:p>
+            <w:r>
+              <w:t>Пропорция между 4:3 и 16:9. Без обрезки в картинку объявления не встаёт. Правый блок «2027 / Новый год» легко срезать.</w:t>
+            </w:r>
+          </w:p>
+        </w:tc>
+      </w:tr>
+      <w:tr>
+        <w:tc>
+          <w:tcPr>
+            <w:tcW w:type="dxa" w:w="3400"/>
+          </w:tcPr>
+          <w:p>
+            <w:r>
+              <w:t>02-square-1000x1000.png</w:t>
+            </w:r>
+          </w:p>
+        </w:tc>
+        <w:tc>
+          <w:tcPr>
+            <w:tcW w:type="dxa" w:w="3400"/>
+          </w:tcPr>
+          <w:p>
+            <w:r>
+              <w:t>1000×1000, 1:1, 0,96 МБ</w:t>
+            </w:r>
+          </w:p>
+        </w:tc>
+        <w:tc>
+          <w:tcPr>
+            <w:tcW w:type="dxa" w:w="3400"/>
+          </w:tcPr>
+          <w:p>
+            <w:r>
+              <w:t>Картинка к текстовому объявлению в сетях. Минимум 450 px пройден, рекомендация от 1080 чуть выше.</w:t>
+            </w:r>
+          </w:p>
+        </w:tc>
+      </w:tr>
+    </w:tbl>
+    <w:p>
+      <w:pPr>
+        <w:spacing w:after="120" w:before="0"/>
+      </w:pPr>
+      <w:r>
+        <w:rPr>
+          <w:rFonts w:ascii="Calibri" w:hAnsi="Calibri"/>
+          <w:b w:val="0"/>
+          <w:color w:val="14283A"/>
+          <w:sz w:val="22"/>
+        </w:rPr>
+      </w:r>
+    </w:p>
+    <w:p>
+      <w:pPr>
+        <w:spacing w:after="120" w:before="0"/>
+      </w:pPr>
+      <w:r>
+        <w:rPr>
+          <w:rFonts w:ascii="Calibri" w:hAnsi="Calibri"/>
+          <w:b w:val="0"/>
+          <w:color w:val="14283A"/>
+          <w:sz w:val="22"/>
+        </w:rPr>
+        <w:t>Оба PNG тяжелее 512 КБ и не совпадают с блоками 240×400, 300×250 и 728×90. Салют на широком кадре в текст услуги не переносим. Посадка, если сети включат: https://boat-sochi.ru/yacht_tigger. Телефон на макетах не написан: +7 917 675-05-55.</w:t>
+      </w:r>
+    </w:p>
+    <w:p>
+      <w:pPr>
+        <w:pStyle w:val="Heading1"/>
+      </w:pPr>
+      <w:r>
+        <w:rPr>
+          <w:color w:val="14283A"/>
+        </w:rPr>
+        <w:t>6. Вопросы до публикации</w:t>
       </w:r>
     </w:p>
     <w:p>
@@ -2474,6 +2648,20 @@
           <w:sz w:val="22"/>
         </w:rPr>
         <w:t>Группы кладём в текущую РК, бюджет 10 000 ₽ и CPA не меняем?</w:t>
+      </w:r>
+    </w:p>
+    <w:p>
+      <w:pPr>
+        <w:pStyle w:val="ListBullet"/>
+      </w:pPr>
+      <w:r>
+        <w:rPr>
+          <w:rFonts w:ascii="Calibri" w:hAnsi="Calibri"/>
+          <w:b w:val="0"/>
+          <w:color w:val="14283A"/>
+          <w:sz w:val="22"/>
+        </w:rPr>
+        <w:t>РСЯ этими двумя файлами запускать отдельно или пока только хранить?</w:t>
       </w:r>
     </w:p>
     <w:sectPr>

</xml_diff>